<commit_message>
docs(readme): mise en avant des réalisations
</commit_message>
<xml_diff>
--- a/CR/Feedback_Coaching_Devs_DACCORD.docx
+++ b/CR/Feedback_Coaching_Devs_DACCORD.docx
@@ -79,7 +79,6 @@
           <w:ilvl w:val="0"/>
           <w:numId w:val="1"/>
         </w:numPr>
-        <w:pBdr/>
         <w:tabs>
           <w:tab w:val="clear" w:pos="720"/>
           <w:tab w:val="left" w:pos="0" w:leader="none"/>
@@ -90,6 +89,7 @@
         <w:rPr>
           <w:rFonts w:ascii="Arial;sans-serif" w:hAnsi="Arial;sans-serif"/>
           <w:b w:val="false"/>
+          <w:i w:val="false"/>
           <w:i w:val="false"/>
           <w:caps w:val="false"/>
           <w:smallCaps w:val="false"/>
@@ -127,7 +127,6 @@
           <w:ilvl w:val="0"/>
           <w:numId w:val="1"/>
         </w:numPr>
-        <w:pBdr/>
         <w:tabs>
           <w:tab w:val="clear" w:pos="720"/>
           <w:tab w:val="left" w:pos="0" w:leader="none"/>
@@ -138,6 +137,7 @@
         <w:rPr>
           <w:rFonts w:ascii="Arial;sans-serif" w:hAnsi="Arial;sans-serif"/>
           <w:b w:val="false"/>
+          <w:i w:val="false"/>
           <w:i w:val="false"/>
           <w:caps w:val="false"/>
           <w:smallCaps w:val="false"/>
@@ -175,7 +175,6 @@
           <w:ilvl w:val="0"/>
           <w:numId w:val="1"/>
         </w:numPr>
-        <w:pBdr/>
         <w:tabs>
           <w:tab w:val="clear" w:pos="720"/>
           <w:tab w:val="left" w:pos="0" w:leader="none"/>
@@ -186,6 +185,7 @@
         <w:rPr>
           <w:rFonts w:ascii="Arial;sans-serif" w:hAnsi="Arial;sans-serif"/>
           <w:b w:val="false"/>
+          <w:i w:val="false"/>
           <w:i w:val="false"/>
           <w:caps w:val="false"/>
           <w:smallCaps w:val="false"/>
@@ -223,7 +223,6 @@
           <w:ilvl w:val="0"/>
           <w:numId w:val="1"/>
         </w:numPr>
-        <w:pBdr/>
         <w:tabs>
           <w:tab w:val="clear" w:pos="720"/>
           <w:tab w:val="left" w:pos="0" w:leader="none"/>
@@ -234,6 +233,7 @@
         <w:rPr>
           <w:rFonts w:ascii="Arial;sans-serif" w:hAnsi="Arial;sans-serif"/>
           <w:b w:val="false"/>
+          <w:i w:val="false"/>
           <w:i w:val="false"/>
           <w:caps w:val="false"/>
           <w:smallCaps w:val="false"/>
@@ -271,7 +271,6 @@
           <w:ilvl w:val="1"/>
           <w:numId w:val="1"/>
         </w:numPr>
-        <w:pBdr/>
         <w:tabs>
           <w:tab w:val="clear" w:pos="720"/>
           <w:tab w:val="left" w:pos="0" w:leader="none"/>
@@ -282,6 +281,7 @@
         <w:rPr>
           <w:rFonts w:ascii="Arial;sans-serif" w:hAnsi="Arial;sans-serif"/>
           <w:b w:val="false"/>
+          <w:i w:val="false"/>
           <w:i w:val="false"/>
           <w:caps w:val="false"/>
           <w:smallCaps w:val="false"/>
@@ -319,7 +319,6 @@
           <w:ilvl w:val="0"/>
           <w:numId w:val="1"/>
         </w:numPr>
-        <w:pBdr/>
         <w:tabs>
           <w:tab w:val="clear" w:pos="720"/>
           <w:tab w:val="left" w:pos="0" w:leader="none"/>
@@ -331,6 +330,7 @@
           <w:rFonts w:ascii="Arial;sans-serif" w:hAnsi="Arial;sans-serif"/>
           <w:b w:val="false"/>
           <w:i w:val="false"/>
+          <w:i w:val="false"/>
           <w:caps w:val="false"/>
           <w:smallCaps w:val="false"/>
           <w:strike w:val="false"/>
@@ -362,20 +362,636 @@
     </w:p>
     <w:p>
       <w:pPr>
-        <w:pStyle w:val="normal1"/>
-        <w:rPr/>
-      </w:pPr>
-      <w:r>
-        <w:rPr/>
-      </w:r>
-    </w:p>
-    <w:p>
-      <w:pPr>
-        <w:pStyle w:val="normal1"/>
-        <w:rPr/>
-      </w:pPr>
-      <w:r>
-        <w:rPr/>
+        <w:pStyle w:val="BodyText"/>
+        <w:tabs>
+          <w:tab w:val="clear" w:pos="720"/>
+          <w:tab w:val="left" w:pos="0" w:leader="none"/>
+        </w:tabs>
+        <w:bidi w:val="0"/>
+        <w:spacing w:lineRule="auto" w:line="331" w:before="200" w:after="0"/>
+        <w:ind w:hanging="283" w:left="709" w:right="0"/>
+        <w:rPr>
+          <w:u w:val="double"/>
+        </w:rPr>
+      </w:pPr>
+      <w:r>
+        <w:rPr>
+          <w:u w:val="double"/>
+        </w:rPr>
+      </w:r>
+    </w:p>
+    <w:p>
+      <w:pPr>
+        <w:pStyle w:val="BodyText"/>
+        <w:widowControl/>
+        <w:tabs>
+          <w:tab w:val="clear" w:pos="720"/>
+          <w:tab w:val="left" w:pos="0" w:leader="none"/>
+        </w:tabs>
+        <w:suppressAutoHyphens w:val="true"/>
+        <w:bidi w:val="0"/>
+        <w:spacing w:lineRule="auto" w:line="331"/>
+        <w:ind w:hanging="0" w:right="0"/>
+        <w:jc w:val="left"/>
+        <w:rPr>
+          <w:rFonts w:ascii="Arial;sans-serif" w:hAnsi="Arial;sans-serif" w:eastAsia="Arial" w:cs="Arial"/>
+          <w:b w:val="false"/>
+          <w:i w:val="false"/>
+          <w:i w:val="false"/>
+          <w:caps w:val="false"/>
+          <w:smallCaps w:val="false"/>
+          <w:strike w:val="false"/>
+          <w:dstrike w:val="false"/>
+          <w:color w:val="000000"/>
+          <w:kern w:val="0"/>
+          <w:sz w:val="22"/>
+          <w:szCs w:val="22"/>
+          <w:u w:val="none"/>
+          <w:effect w:val="none"/>
+          <w:shd w:fill="auto" w:val="clear"/>
+          <w:lang w:val="fr-FR" w:eastAsia="zh-CN" w:bidi="hi-IN"/>
+        </w:rPr>
+      </w:pPr>
+      <w:r>
+        <w:rPr>
+          <w:rFonts w:eastAsia="Arial" w:cs="Arial" w:ascii="Arial;sans-serif" w:hAnsi="Arial;sans-serif"/>
+          <w:b w:val="false"/>
+          <w:i w:val="false"/>
+          <w:caps w:val="false"/>
+          <w:smallCaps w:val="false"/>
+          <w:strike w:val="false"/>
+          <w:dstrike w:val="false"/>
+          <w:color w:val="000000"/>
+          <w:kern w:val="0"/>
+          <w:sz w:val="22"/>
+          <w:szCs w:val="22"/>
+          <w:u w:val="none"/>
+          <w:effect w:val="none"/>
+          <w:shd w:fill="auto" w:val="clear"/>
+          <w:lang w:val="fr-FR" w:eastAsia="zh-CN" w:bidi="hi-IN"/>
+        </w:rPr>
+        <w:t>Feedback récupéré :</w:t>
+      </w:r>
+    </w:p>
+    <w:p>
+      <w:pPr>
+        <w:pStyle w:val="BodyText"/>
+        <w:widowControl/>
+        <w:tabs>
+          <w:tab w:val="clear" w:pos="720"/>
+          <w:tab w:val="left" w:pos="0" w:leader="none"/>
+        </w:tabs>
+        <w:suppressAutoHyphens w:val="true"/>
+        <w:bidi w:val="0"/>
+        <w:spacing w:lineRule="auto" w:line="331"/>
+        <w:ind w:hanging="0" w:right="0"/>
+        <w:jc w:val="left"/>
+        <w:rPr>
+          <w:rFonts w:ascii="Arial;sans-serif" w:hAnsi="Arial;sans-serif" w:eastAsia="Arial" w:cs="Arial"/>
+          <w:b w:val="false"/>
+          <w:i w:val="false"/>
+          <w:i w:val="false"/>
+          <w:caps w:val="false"/>
+          <w:smallCaps w:val="false"/>
+          <w:strike w:val="false"/>
+          <w:dstrike w:val="false"/>
+          <w:color w:val="000000"/>
+          <w:kern w:val="0"/>
+          <w:sz w:val="22"/>
+          <w:szCs w:val="22"/>
+          <w:u w:val="none"/>
+          <w:effect w:val="none"/>
+          <w:shd w:fill="auto" w:val="clear"/>
+          <w:lang w:val="fr-FR" w:eastAsia="zh-CN" w:bidi="hi-IN"/>
+        </w:rPr>
+      </w:pPr>
+      <w:r>
+        <w:rPr>
+          <w:rFonts w:eastAsia="Arial" w:cs="Arial" w:ascii="Arial;sans-serif" w:hAnsi="Arial;sans-serif"/>
+          <w:b w:val="false"/>
+          <w:i w:val="false"/>
+          <w:caps w:val="false"/>
+          <w:smallCaps w:val="false"/>
+          <w:strike w:val="false"/>
+          <w:dstrike w:val="false"/>
+          <w:color w:val="000000"/>
+          <w:kern w:val="0"/>
+          <w:sz w:val="22"/>
+          <w:szCs w:val="22"/>
+          <w:u w:val="none"/>
+          <w:effect w:val="none"/>
+          <w:shd w:fill="auto" w:val="clear"/>
+          <w:lang w:val="fr-FR" w:eastAsia="zh-CN" w:bidi="hi-IN"/>
+        </w:rPr>
+        <w:t>Positif :</w:t>
+      </w:r>
+    </w:p>
+    <w:p>
+      <w:pPr>
+        <w:pStyle w:val="BodyText"/>
+        <w:widowControl/>
+        <w:numPr>
+          <w:ilvl w:val="0"/>
+          <w:numId w:val="1"/>
+        </w:numPr>
+        <w:tabs>
+          <w:tab w:val="clear" w:pos="720"/>
+          <w:tab w:val="left" w:pos="0" w:leader="none"/>
+        </w:tabs>
+        <w:suppressAutoHyphens w:val="true"/>
+        <w:bidi w:val="0"/>
+        <w:spacing w:lineRule="auto" w:line="331"/>
+        <w:ind w:hanging="283" w:right="0"/>
+        <w:jc w:val="left"/>
+        <w:rPr>
+          <w:rFonts w:ascii="Arial;sans-serif" w:hAnsi="Arial;sans-serif" w:eastAsia="Arial" w:cs="Arial"/>
+          <w:b w:val="false"/>
+          <w:i w:val="false"/>
+          <w:i w:val="false"/>
+          <w:caps w:val="false"/>
+          <w:smallCaps w:val="false"/>
+          <w:strike w:val="false"/>
+          <w:dstrike w:val="false"/>
+          <w:color w:val="000000"/>
+          <w:kern w:val="0"/>
+          <w:sz w:val="22"/>
+          <w:szCs w:val="22"/>
+          <w:u w:val="none"/>
+          <w:effect w:val="none"/>
+          <w:shd w:fill="auto" w:val="clear"/>
+          <w:lang w:val="fr-FR" w:eastAsia="zh-CN" w:bidi="hi-IN"/>
+        </w:rPr>
+      </w:pPr>
+      <w:r>
+        <w:rPr>
+          <w:rFonts w:eastAsia="Arial" w:cs="Arial" w:ascii="Arial;sans-serif" w:hAnsi="Arial;sans-serif"/>
+          <w:b w:val="false"/>
+          <w:i w:val="false"/>
+          <w:caps w:val="false"/>
+          <w:smallCaps w:val="false"/>
+          <w:strike w:val="false"/>
+          <w:dstrike w:val="false"/>
+          <w:color w:val="000000"/>
+          <w:kern w:val="0"/>
+          <w:sz w:val="22"/>
+          <w:szCs w:val="22"/>
+          <w:u w:val="none"/>
+          <w:effect w:val="none"/>
+          <w:shd w:fill="auto" w:val="clear"/>
+          <w:lang w:val="fr-FR" w:eastAsia="zh-CN" w:bidi="hi-IN"/>
+        </w:rPr>
+        <w:t>la formation a rendu abordable des sujets qui auraient pu être compliqués</w:t>
+      </w:r>
+    </w:p>
+    <w:p>
+      <w:pPr>
+        <w:pStyle w:val="BodyText"/>
+        <w:widowControl/>
+        <w:numPr>
+          <w:ilvl w:val="0"/>
+          <w:numId w:val="1"/>
+        </w:numPr>
+        <w:tabs>
+          <w:tab w:val="clear" w:pos="720"/>
+          <w:tab w:val="left" w:pos="0" w:leader="none"/>
+        </w:tabs>
+        <w:suppressAutoHyphens w:val="true"/>
+        <w:bidi w:val="0"/>
+        <w:spacing w:lineRule="auto" w:line="331"/>
+        <w:ind w:hanging="283" w:right="0"/>
+        <w:jc w:val="left"/>
+        <w:rPr>
+          <w:rFonts w:ascii="Arial;sans-serif" w:hAnsi="Arial;sans-serif" w:eastAsia="Arial" w:cs="Arial"/>
+          <w:b w:val="false"/>
+          <w:i w:val="false"/>
+          <w:i w:val="false"/>
+          <w:caps w:val="false"/>
+          <w:smallCaps w:val="false"/>
+          <w:strike w:val="false"/>
+          <w:dstrike w:val="false"/>
+          <w:color w:val="000000"/>
+          <w:kern w:val="0"/>
+          <w:sz w:val="22"/>
+          <w:szCs w:val="22"/>
+          <w:u w:val="none"/>
+          <w:effect w:val="none"/>
+          <w:shd w:fill="auto" w:val="clear"/>
+          <w:lang w:val="fr-FR" w:eastAsia="zh-CN" w:bidi="hi-IN"/>
+        </w:rPr>
+      </w:pPr>
+      <w:r>
+        <w:rPr>
+          <w:rFonts w:eastAsia="Arial" w:cs="Arial" w:ascii="Arial;sans-serif" w:hAnsi="Arial;sans-serif"/>
+          <w:b w:val="false"/>
+          <w:i w:val="false"/>
+          <w:caps w:val="false"/>
+          <w:smallCaps w:val="false"/>
+          <w:strike w:val="false"/>
+          <w:dstrike w:val="false"/>
+          <w:color w:val="000000"/>
+          <w:kern w:val="0"/>
+          <w:sz w:val="22"/>
+          <w:szCs w:val="22"/>
+          <w:u w:val="none"/>
+          <w:effect w:val="none"/>
+          <w:shd w:fill="auto" w:val="clear"/>
+          <w:lang w:val="fr-FR" w:eastAsia="zh-CN" w:bidi="hi-IN"/>
+        </w:rPr>
+        <w:t xml:space="preserve">le côté interactif de la session </w:t>
+      </w:r>
+    </w:p>
+    <w:p>
+      <w:pPr>
+        <w:pStyle w:val="BodyText"/>
+        <w:widowControl/>
+        <w:numPr>
+          <w:ilvl w:val="0"/>
+          <w:numId w:val="1"/>
+        </w:numPr>
+        <w:tabs>
+          <w:tab w:val="clear" w:pos="720"/>
+          <w:tab w:val="left" w:pos="0" w:leader="none"/>
+        </w:tabs>
+        <w:suppressAutoHyphens w:val="true"/>
+        <w:bidi w:val="0"/>
+        <w:spacing w:lineRule="auto" w:line="331"/>
+        <w:ind w:hanging="283" w:right="0"/>
+        <w:jc w:val="left"/>
+        <w:rPr>
+          <w:rFonts w:ascii="Arial;sans-serif" w:hAnsi="Arial;sans-serif" w:eastAsia="Arial" w:cs="Arial"/>
+          <w:b w:val="false"/>
+          <w:i w:val="false"/>
+          <w:i w:val="false"/>
+          <w:caps w:val="false"/>
+          <w:smallCaps w:val="false"/>
+          <w:strike w:val="false"/>
+          <w:dstrike w:val="false"/>
+          <w:color w:val="000000"/>
+          <w:kern w:val="0"/>
+          <w:sz w:val="22"/>
+          <w:szCs w:val="22"/>
+          <w:u w:val="none"/>
+          <w:effect w:val="none"/>
+          <w:shd w:fill="auto" w:val="clear"/>
+          <w:lang w:val="fr-FR" w:eastAsia="zh-CN" w:bidi="hi-IN"/>
+        </w:rPr>
+      </w:pPr>
+      <w:r>
+        <w:rPr>
+          <w:rFonts w:eastAsia="Arial" w:cs="Arial" w:ascii="Arial;sans-serif" w:hAnsi="Arial;sans-serif"/>
+          <w:b w:val="false"/>
+          <w:i w:val="false"/>
+          <w:caps w:val="false"/>
+          <w:smallCaps w:val="false"/>
+          <w:strike w:val="false"/>
+          <w:dstrike w:val="false"/>
+          <w:color w:val="000000"/>
+          <w:kern w:val="0"/>
+          <w:sz w:val="22"/>
+          <w:szCs w:val="22"/>
+          <w:u w:val="none"/>
+          <w:effect w:val="none"/>
+          <w:shd w:fill="auto" w:val="clear"/>
+          <w:lang w:val="fr-FR" w:eastAsia="zh-CN" w:bidi="hi-IN"/>
+        </w:rPr>
+        <w:t>le fait de pouvoir poser des questions au fur et à mesure</w:t>
+      </w:r>
+    </w:p>
+    <w:p>
+      <w:pPr>
+        <w:pStyle w:val="BodyText"/>
+        <w:widowControl/>
+        <w:numPr>
+          <w:ilvl w:val="0"/>
+          <w:numId w:val="1"/>
+        </w:numPr>
+        <w:tabs>
+          <w:tab w:val="clear" w:pos="720"/>
+          <w:tab w:val="left" w:pos="0" w:leader="none"/>
+        </w:tabs>
+        <w:suppressAutoHyphens w:val="true"/>
+        <w:bidi w:val="0"/>
+        <w:spacing w:lineRule="auto" w:line="331"/>
+        <w:ind w:hanging="283" w:right="0"/>
+        <w:jc w:val="left"/>
+        <w:rPr>
+          <w:rFonts w:ascii="Arial;sans-serif" w:hAnsi="Arial;sans-serif" w:eastAsia="Arial" w:cs="Arial"/>
+          <w:b w:val="false"/>
+          <w:i w:val="false"/>
+          <w:i w:val="false"/>
+          <w:caps w:val="false"/>
+          <w:smallCaps w:val="false"/>
+          <w:strike w:val="false"/>
+          <w:dstrike w:val="false"/>
+          <w:color w:val="000000"/>
+          <w:kern w:val="0"/>
+          <w:sz w:val="22"/>
+          <w:szCs w:val="22"/>
+          <w:u w:val="none"/>
+          <w:effect w:val="none"/>
+          <w:shd w:fill="auto" w:val="clear"/>
+          <w:lang w:val="fr-FR" w:eastAsia="zh-CN" w:bidi="hi-IN"/>
+        </w:rPr>
+      </w:pPr>
+      <w:r>
+        <w:rPr>
+          <w:rFonts w:eastAsia="Arial" w:cs="Arial" w:ascii="Arial;sans-serif" w:hAnsi="Arial;sans-serif"/>
+          <w:b w:val="false"/>
+          <w:i w:val="false"/>
+          <w:caps w:val="false"/>
+          <w:smallCaps w:val="false"/>
+          <w:strike w:val="false"/>
+          <w:dstrike w:val="false"/>
+          <w:color w:val="000000"/>
+          <w:kern w:val="0"/>
+          <w:sz w:val="22"/>
+          <w:szCs w:val="22"/>
+          <w:u w:val="none"/>
+          <w:effect w:val="none"/>
+          <w:shd w:fill="auto" w:val="clear"/>
+          <w:lang w:val="fr-FR" w:eastAsia="zh-CN" w:bidi="hi-IN"/>
+        </w:rPr>
+        <w:t>la formation a été claire</w:t>
+      </w:r>
+    </w:p>
+    <w:p>
+      <w:pPr>
+        <w:pStyle w:val="BodyText"/>
+        <w:widowControl/>
+        <w:numPr>
+          <w:ilvl w:val="0"/>
+          <w:numId w:val="1"/>
+        </w:numPr>
+        <w:tabs>
+          <w:tab w:val="clear" w:pos="720"/>
+          <w:tab w:val="left" w:pos="0" w:leader="none"/>
+        </w:tabs>
+        <w:suppressAutoHyphens w:val="true"/>
+        <w:bidi w:val="0"/>
+        <w:spacing w:lineRule="auto" w:line="331"/>
+        <w:ind w:hanging="283" w:right="0"/>
+        <w:jc w:val="left"/>
+        <w:rPr>
+          <w:rFonts w:ascii="Arial;sans-serif" w:hAnsi="Arial;sans-serif" w:eastAsia="Arial" w:cs="Arial"/>
+          <w:b w:val="false"/>
+          <w:i w:val="false"/>
+          <w:i w:val="false"/>
+          <w:caps w:val="false"/>
+          <w:smallCaps w:val="false"/>
+          <w:strike w:val="false"/>
+          <w:dstrike w:val="false"/>
+          <w:color w:val="000000"/>
+          <w:kern w:val="0"/>
+          <w:sz w:val="22"/>
+          <w:szCs w:val="22"/>
+          <w:u w:val="none"/>
+          <w:effect w:val="none"/>
+          <w:shd w:fill="auto" w:val="clear"/>
+          <w:lang w:val="fr-FR" w:eastAsia="zh-CN" w:bidi="hi-IN"/>
+        </w:rPr>
+      </w:pPr>
+      <w:r>
+        <w:rPr>
+          <w:rFonts w:eastAsia="Arial" w:cs="Arial" w:ascii="Arial;sans-serif" w:hAnsi="Arial;sans-serif"/>
+          <w:b w:val="false"/>
+          <w:i w:val="false"/>
+          <w:caps w:val="false"/>
+          <w:smallCaps w:val="false"/>
+          <w:strike w:val="false"/>
+          <w:dstrike w:val="false"/>
+          <w:color w:val="000000"/>
+          <w:kern w:val="0"/>
+          <w:sz w:val="22"/>
+          <w:szCs w:val="22"/>
+          <w:u w:val="none"/>
+          <w:effect w:val="none"/>
+          <w:shd w:fill="auto" w:val="clear"/>
+          <w:lang w:val="fr-FR" w:eastAsia="zh-CN" w:bidi="hi-IN"/>
+        </w:rPr>
+        <w:t>les exemples concrets ont aidé à comprendre les concepts</w:t>
+      </w:r>
+    </w:p>
+    <w:p>
+      <w:pPr>
+        <w:pStyle w:val="BodyText"/>
+        <w:widowControl/>
+        <w:numPr>
+          <w:ilvl w:val="0"/>
+          <w:numId w:val="1"/>
+        </w:numPr>
+        <w:tabs>
+          <w:tab w:val="clear" w:pos="720"/>
+          <w:tab w:val="left" w:pos="0" w:leader="none"/>
+        </w:tabs>
+        <w:suppressAutoHyphens w:val="true"/>
+        <w:bidi w:val="0"/>
+        <w:spacing w:lineRule="auto" w:line="331"/>
+        <w:ind w:hanging="283" w:right="0"/>
+        <w:jc w:val="left"/>
+        <w:rPr>
+          <w:rFonts w:ascii="Arial;sans-serif" w:hAnsi="Arial;sans-serif" w:eastAsia="Arial" w:cs="Arial"/>
+          <w:b w:val="false"/>
+          <w:i w:val="false"/>
+          <w:i w:val="false"/>
+          <w:caps w:val="false"/>
+          <w:smallCaps w:val="false"/>
+          <w:strike w:val="false"/>
+          <w:dstrike w:val="false"/>
+          <w:color w:val="000000"/>
+          <w:kern w:val="0"/>
+          <w:sz w:val="22"/>
+          <w:szCs w:val="22"/>
+          <w:u w:val="none"/>
+          <w:effect w:val="none"/>
+          <w:shd w:fill="auto" w:val="clear"/>
+          <w:lang w:val="fr-FR" w:eastAsia="zh-CN" w:bidi="hi-IN"/>
+        </w:rPr>
+      </w:pPr>
+      <w:r>
+        <w:rPr>
+          <w:rFonts w:eastAsia="Arial" w:cs="Arial" w:ascii="Arial;sans-serif" w:hAnsi="Arial;sans-serif"/>
+          <w:b w:val="false"/>
+          <w:i w:val="false"/>
+          <w:caps w:val="false"/>
+          <w:smallCaps w:val="false"/>
+          <w:strike w:val="false"/>
+          <w:dstrike w:val="false"/>
+          <w:color w:val="000000"/>
+          <w:kern w:val="0"/>
+          <w:sz w:val="22"/>
+          <w:szCs w:val="22"/>
+          <w:u w:val="none"/>
+          <w:effect w:val="none"/>
+          <w:shd w:fill="auto" w:val="clear"/>
+          <w:lang w:val="fr-FR" w:eastAsia="zh-CN" w:bidi="hi-IN"/>
+        </w:rPr>
+        <w:t>Le fait de partir du niveau de l'équipe, et qu'on parvienne quand même à la fin à comprendre les orchestrations, tout en ayant le sentiment que c'est ateignable</w:t>
+      </w:r>
+    </w:p>
+    <w:p>
+      <w:pPr>
+        <w:pStyle w:val="BodyText"/>
+        <w:widowControl/>
+        <w:numPr>
+          <w:ilvl w:val="0"/>
+          <w:numId w:val="1"/>
+        </w:numPr>
+        <w:tabs>
+          <w:tab w:val="clear" w:pos="720"/>
+          <w:tab w:val="left" w:pos="0" w:leader="none"/>
+        </w:tabs>
+        <w:suppressAutoHyphens w:val="true"/>
+        <w:bidi w:val="0"/>
+        <w:spacing w:lineRule="auto" w:line="331"/>
+        <w:ind w:hanging="283" w:right="0"/>
+        <w:jc w:val="left"/>
+        <w:rPr>
+          <w:rFonts w:ascii="Arial;sans-serif" w:hAnsi="Arial;sans-serif" w:eastAsia="Arial" w:cs="Arial"/>
+          <w:b w:val="false"/>
+          <w:i w:val="false"/>
+          <w:i w:val="false"/>
+          <w:caps w:val="false"/>
+          <w:smallCaps w:val="false"/>
+          <w:strike w:val="false"/>
+          <w:dstrike w:val="false"/>
+          <w:color w:val="000000"/>
+          <w:kern w:val="0"/>
+          <w:sz w:val="22"/>
+          <w:szCs w:val="22"/>
+          <w:u w:val="none"/>
+          <w:effect w:val="none"/>
+          <w:shd w:fill="auto" w:val="clear"/>
+          <w:lang w:val="fr-FR" w:eastAsia="zh-CN" w:bidi="hi-IN"/>
+        </w:rPr>
+      </w:pPr>
+      <w:r>
+        <w:rPr>
+          <w:rFonts w:eastAsia="Arial" w:cs="Arial" w:ascii="Arial;sans-serif" w:hAnsi="Arial;sans-serif"/>
+          <w:b w:val="false"/>
+          <w:i w:val="false"/>
+          <w:caps w:val="false"/>
+          <w:smallCaps w:val="false"/>
+          <w:strike w:val="false"/>
+          <w:dstrike w:val="false"/>
+          <w:color w:val="000000"/>
+          <w:kern w:val="0"/>
+          <w:sz w:val="22"/>
+          <w:szCs w:val="22"/>
+          <w:u w:val="none"/>
+          <w:effect w:val="none"/>
+          <w:shd w:fill="auto" w:val="clear"/>
+          <w:lang w:val="fr-FR" w:eastAsia="zh-CN" w:bidi="hi-IN"/>
+        </w:rPr>
+        <w:t>la formation permet de se projeter sur les compétences à acquérir</w:t>
+      </w:r>
+    </w:p>
+    <w:p>
+      <w:pPr>
+        <w:pStyle w:val="BodyText"/>
+        <w:widowControl/>
+        <w:tabs>
+          <w:tab w:val="clear" w:pos="720"/>
+          <w:tab w:val="left" w:pos="0" w:leader="none"/>
+        </w:tabs>
+        <w:suppressAutoHyphens w:val="true"/>
+        <w:bidi w:val="0"/>
+        <w:spacing w:lineRule="auto" w:line="331"/>
+        <w:ind w:hanging="0" w:right="0"/>
+        <w:jc w:val="left"/>
+        <w:rPr>
+          <w:rFonts w:ascii="Arial;sans-serif" w:hAnsi="Arial;sans-serif" w:eastAsia="Arial" w:cs="Arial"/>
+          <w:b w:val="false"/>
+          <w:i w:val="false"/>
+          <w:i w:val="false"/>
+          <w:caps w:val="false"/>
+          <w:smallCaps w:val="false"/>
+          <w:strike w:val="false"/>
+          <w:dstrike w:val="false"/>
+          <w:color w:val="000000"/>
+          <w:kern w:val="0"/>
+          <w:sz w:val="22"/>
+          <w:szCs w:val="22"/>
+          <w:u w:val="none"/>
+          <w:effect w:val="none"/>
+          <w:shd w:fill="auto" w:val="clear"/>
+          <w:lang w:val="fr-FR" w:eastAsia="zh-CN" w:bidi="hi-IN"/>
+        </w:rPr>
+      </w:pPr>
+      <w:r>
+        <w:rPr>
+          <w:rFonts w:eastAsia="Arial" w:cs="Arial" w:ascii="Arial;sans-serif" w:hAnsi="Arial;sans-serif"/>
+          <w:b w:val="false"/>
+          <w:i w:val="false"/>
+          <w:caps w:val="false"/>
+          <w:smallCaps w:val="false"/>
+          <w:strike w:val="false"/>
+          <w:dstrike w:val="false"/>
+          <w:color w:val="000000"/>
+          <w:kern w:val="0"/>
+          <w:sz w:val="22"/>
+          <w:szCs w:val="22"/>
+          <w:u w:val="none"/>
+          <w:effect w:val="none"/>
+          <w:shd w:fill="auto" w:val="clear"/>
+          <w:lang w:val="fr-FR" w:eastAsia="zh-CN" w:bidi="hi-IN"/>
+        </w:rPr>
+        <w:t>Enseignement pour la prochaine fois :</w:t>
+      </w:r>
+    </w:p>
+    <w:p>
+      <w:pPr>
+        <w:pStyle w:val="BodyText"/>
+        <w:widowControl/>
+        <w:numPr>
+          <w:ilvl w:val="0"/>
+          <w:numId w:val="2"/>
+        </w:numPr>
+        <w:tabs>
+          <w:tab w:val="clear" w:pos="720"/>
+          <w:tab w:val="left" w:pos="0" w:leader="none"/>
+        </w:tabs>
+        <w:suppressAutoHyphens w:val="true"/>
+        <w:bidi w:val="0"/>
+        <w:spacing w:lineRule="auto" w:line="331"/>
+        <w:jc w:val="left"/>
+        <w:rPr>
+          <w:rFonts w:ascii="Arial;sans-serif" w:hAnsi="Arial;sans-serif" w:eastAsia="Arial" w:cs="Arial"/>
+          <w:b w:val="false"/>
+          <w:i w:val="false"/>
+          <w:i w:val="false"/>
+          <w:caps w:val="false"/>
+          <w:smallCaps w:val="false"/>
+          <w:strike w:val="false"/>
+          <w:dstrike w:val="false"/>
+          <w:color w:val="000000"/>
+          <w:kern w:val="0"/>
+          <w:sz w:val="22"/>
+          <w:szCs w:val="22"/>
+          <w:u w:val="none"/>
+          <w:effect w:val="none"/>
+          <w:shd w:fill="auto" w:val="clear"/>
+          <w:lang w:val="fr-FR" w:eastAsia="zh-CN" w:bidi="hi-IN"/>
+        </w:rPr>
+      </w:pPr>
+      <w:r>
+        <w:rPr>
+          <w:rFonts w:eastAsia="Arial" w:cs="Arial" w:ascii="Arial;sans-serif" w:hAnsi="Arial;sans-serif"/>
+          <w:b w:val="false"/>
+          <w:i w:val="false"/>
+          <w:caps w:val="false"/>
+          <w:smallCaps w:val="false"/>
+          <w:strike w:val="false"/>
+          <w:dstrike w:val="false"/>
+          <w:color w:val="000000"/>
+          <w:kern w:val="0"/>
+          <w:sz w:val="22"/>
+          <w:szCs w:val="22"/>
+          <w:u w:val="none"/>
+          <w:effect w:val="none"/>
+          <w:shd w:fill="auto" w:val="clear"/>
+          <w:lang w:val="fr-FR" w:eastAsia="zh-CN" w:bidi="hi-IN"/>
+        </w:rPr>
+        <w:t>Prévoir que l’écran peut trop refléter la lumière de la salle (Eureka)</w:t>
       </w:r>
     </w:p>
     <w:p>
@@ -542,6 +1158,143 @@
   <w:abstractNum w:abstractNumId="2">
     <w:lvl w:ilvl="0">
       <w:start w:val="1"/>
+      <w:numFmt w:val="bullet"/>
+      <w:lvlText w:val=""/>
+      <w:lvlJc w:val="left"/>
+      <w:pPr>
+        <w:tabs>
+          <w:tab w:val="num" w:pos="720"/>
+        </w:tabs>
+        <w:ind w:left="720" w:hanging="360"/>
+      </w:pPr>
+      <w:rPr>
+        <w:rFonts w:ascii="Symbol" w:hAnsi="Symbol" w:cs="Symbol" w:hint="default"/>
+      </w:rPr>
+    </w:lvl>
+    <w:lvl w:ilvl="1">
+      <w:start w:val="1"/>
+      <w:numFmt w:val="bullet"/>
+      <w:lvlText w:val="◦"/>
+      <w:lvlJc w:val="left"/>
+      <w:pPr>
+        <w:tabs>
+          <w:tab w:val="num" w:pos="1080"/>
+        </w:tabs>
+        <w:ind w:left="1080" w:hanging="360"/>
+      </w:pPr>
+      <w:rPr>
+        <w:rFonts w:ascii="OpenSymbol" w:hAnsi="OpenSymbol" w:cs="OpenSymbol" w:hint="default"/>
+      </w:rPr>
+    </w:lvl>
+    <w:lvl w:ilvl="2">
+      <w:start w:val="1"/>
+      <w:numFmt w:val="bullet"/>
+      <w:lvlText w:val="▪"/>
+      <w:lvlJc w:val="left"/>
+      <w:pPr>
+        <w:tabs>
+          <w:tab w:val="num" w:pos="1440"/>
+        </w:tabs>
+        <w:ind w:left="1440" w:hanging="360"/>
+      </w:pPr>
+      <w:rPr>
+        <w:rFonts w:ascii="OpenSymbol" w:hAnsi="OpenSymbol" w:cs="OpenSymbol" w:hint="default"/>
+      </w:rPr>
+    </w:lvl>
+    <w:lvl w:ilvl="3">
+      <w:start w:val="1"/>
+      <w:numFmt w:val="bullet"/>
+      <w:lvlText w:val=""/>
+      <w:lvlJc w:val="left"/>
+      <w:pPr>
+        <w:tabs>
+          <w:tab w:val="num" w:pos="1800"/>
+        </w:tabs>
+        <w:ind w:left="1800" w:hanging="360"/>
+      </w:pPr>
+      <w:rPr>
+        <w:rFonts w:ascii="Symbol" w:hAnsi="Symbol" w:cs="Symbol" w:hint="default"/>
+      </w:rPr>
+    </w:lvl>
+    <w:lvl w:ilvl="4">
+      <w:start w:val="1"/>
+      <w:numFmt w:val="bullet"/>
+      <w:lvlText w:val="◦"/>
+      <w:lvlJc w:val="left"/>
+      <w:pPr>
+        <w:tabs>
+          <w:tab w:val="num" w:pos="2160"/>
+        </w:tabs>
+        <w:ind w:left="2160" w:hanging="360"/>
+      </w:pPr>
+      <w:rPr>
+        <w:rFonts w:ascii="OpenSymbol" w:hAnsi="OpenSymbol" w:cs="OpenSymbol" w:hint="default"/>
+      </w:rPr>
+    </w:lvl>
+    <w:lvl w:ilvl="5">
+      <w:start w:val="1"/>
+      <w:numFmt w:val="bullet"/>
+      <w:lvlText w:val="▪"/>
+      <w:lvlJc w:val="left"/>
+      <w:pPr>
+        <w:tabs>
+          <w:tab w:val="num" w:pos="2520"/>
+        </w:tabs>
+        <w:ind w:left="2520" w:hanging="360"/>
+      </w:pPr>
+      <w:rPr>
+        <w:rFonts w:ascii="OpenSymbol" w:hAnsi="OpenSymbol" w:cs="OpenSymbol" w:hint="default"/>
+      </w:rPr>
+    </w:lvl>
+    <w:lvl w:ilvl="6">
+      <w:start w:val="1"/>
+      <w:numFmt w:val="bullet"/>
+      <w:lvlText w:val=""/>
+      <w:lvlJc w:val="left"/>
+      <w:pPr>
+        <w:tabs>
+          <w:tab w:val="num" w:pos="2880"/>
+        </w:tabs>
+        <w:ind w:left="2880" w:hanging="360"/>
+      </w:pPr>
+      <w:rPr>
+        <w:rFonts w:ascii="Symbol" w:hAnsi="Symbol" w:cs="Symbol" w:hint="default"/>
+      </w:rPr>
+    </w:lvl>
+    <w:lvl w:ilvl="7">
+      <w:start w:val="1"/>
+      <w:numFmt w:val="bullet"/>
+      <w:lvlText w:val="◦"/>
+      <w:lvlJc w:val="left"/>
+      <w:pPr>
+        <w:tabs>
+          <w:tab w:val="num" w:pos="3240"/>
+        </w:tabs>
+        <w:ind w:left="3240" w:hanging="360"/>
+      </w:pPr>
+      <w:rPr>
+        <w:rFonts w:ascii="OpenSymbol" w:hAnsi="OpenSymbol" w:cs="OpenSymbol" w:hint="default"/>
+      </w:rPr>
+    </w:lvl>
+    <w:lvl w:ilvl="8">
+      <w:start w:val="1"/>
+      <w:numFmt w:val="bullet"/>
+      <w:lvlText w:val="▪"/>
+      <w:lvlJc w:val="left"/>
+      <w:pPr>
+        <w:tabs>
+          <w:tab w:val="num" w:pos="3600"/>
+        </w:tabs>
+        <w:ind w:left="3600" w:hanging="360"/>
+      </w:pPr>
+      <w:rPr>
+        <w:rFonts w:ascii="OpenSymbol" w:hAnsi="OpenSymbol" w:cs="OpenSymbol" w:hint="default"/>
+      </w:rPr>
+    </w:lvl>
+  </w:abstractNum>
+  <w:abstractNum w:abstractNumId="3">
+    <w:lvl w:ilvl="0">
+      <w:start w:val="1"/>
       <w:numFmt w:val="none"/>
       <w:suff w:val="nothing"/>
       <w:lvlText w:val=""/>
@@ -663,6 +1416,9 @@
   </w:num>
   <w:num w:numId="2">
     <w:abstractNumId w:val="2"/>
+  </w:num>
+  <w:num w:numId="3">
+    <w:abstractNumId w:val="3"/>
   </w:num>
 </w:numbering>
 </file>
@@ -689,6 +1445,7 @@
     <w:qFormat/>
     <w:pPr>
       <w:widowControl/>
+      <w:suppressAutoHyphens w:val="true"/>
       <w:bidi w:val="0"/>
       <w:spacing w:lineRule="auto" w:line="276" w:before="0" w:after="0"/>
       <w:jc w:val="left"/>
@@ -878,6 +1635,7 @@
     <w:qFormat/>
     <w:pPr>
       <w:widowControl/>
+      <w:suppressAutoHyphens w:val="true"/>
       <w:bidi w:val="0"/>
       <w:spacing w:lineRule="auto" w:line="276" w:before="0" w:after="0"/>
       <w:jc w:val="left"/>

</xml_diff>